<commit_message>
Add data extraction outputs, figures, supplementary materials, and manuscript artifacts
Includes extracted dataset, PRISMA/PROGRESS-Plus figures, OSF protocol,
PRISMA-ScR checklist, supplementary materials, and repo directory map;
updates research question, search strategy, screening records, and manuscript.

Co-Authored-By: Claude Opus 4.7 <noreply@anthropic.com>
</commit_message>
<xml_diff>
--- a/08_manuscript/manuscript.docx
+++ b/08_manuscript/manuscript.docx
@@ -1486,7 +1486,7 @@
       <w:r>
         <w:drawing>
           <wp:inline xmlns:a="http://schemas.openxmlformats.org/drawingml/2006/main" xmlns:pic="http://schemas.openxmlformats.org/drawingml/2006/picture">
-            <wp:extent cx="5400000" cy="7458113"/>
+            <wp:extent cx="5400000" cy="3500825"/>
             <wp:docPr id="1" name="Picture 1"/>
             <wp:cNvGraphicFramePr>
               <a:graphicFrameLocks noChangeAspect="1"/>
@@ -1507,7 +1507,7 @@
                   <pic:spPr>
                     <a:xfrm>
                       <a:off x="0" y="0"/>
-                      <a:ext cx="5400000" cy="7458113"/>
+                      <a:ext cx="5400000" cy="3500825"/>
                     </a:xfrm>
                     <a:prstGeom prst="rect"/>
                   </pic:spPr>
@@ -1638,7 +1638,7 @@
       <w:r>
         <w:drawing>
           <wp:inline xmlns:a="http://schemas.openxmlformats.org/drawingml/2006/main" xmlns:pic="http://schemas.openxmlformats.org/drawingml/2006/picture">
-            <wp:extent cx="5400000" cy="3579775"/>
+            <wp:extent cx="5400000" cy="3899473"/>
             <wp:docPr id="2" name="Picture 2"/>
             <wp:cNvGraphicFramePr>
               <a:graphicFrameLocks noChangeAspect="1"/>
@@ -1659,7 +1659,7 @@
                   <pic:spPr>
                     <a:xfrm>
                       <a:off x="0" y="0"/>
-                      <a:ext cx="5400000" cy="3579775"/>
+                      <a:ext cx="5400000" cy="3899473"/>
                     </a:xfrm>
                     <a:prstGeom prst="rect"/>
                   </pic:spPr>
@@ -3104,7 +3104,6 @@
     </w:p>
     <w:tbl>
       <w:tblPr>
-        <w:tblStyle w:val="TableGrid"/>
         <w:tblW w:type="auto" w:w="0"/>
         <w:tblLook w:firstColumn="1" w:firstRow="1" w:lastColumn="0" w:lastRow="0" w:noHBand="0" w:noVBand="1" w:val="04A0"/>
         <w:tblBorders>
@@ -3127,6 +3126,8 @@
             <w:tcBorders>
               <w:top w:val="single" w:sz="8" w:color="000000" w:space="0"/>
               <w:bottom w:val="single" w:sz="4" w:color="000000" w:space="0"/>
+              <w:left w:val="none" w:sz="0" w:color="auto" w:space="0"/>
+              <w:right w:val="none" w:sz="0" w:color="auto" w:space="0"/>
             </w:tcBorders>
           </w:tcPr>
           <w:p>
@@ -3152,6 +3153,8 @@
             <w:tcBorders>
               <w:top w:val="single" w:sz="8" w:color="000000" w:space="0"/>
               <w:bottom w:val="single" w:sz="4" w:color="000000" w:space="0"/>
+              <w:left w:val="none" w:sz="0" w:color="auto" w:space="0"/>
+              <w:right w:val="none" w:sz="0" w:color="auto" w:space="0"/>
             </w:tcBorders>
           </w:tcPr>
           <w:p>
@@ -3176,7 +3179,12 @@
         <w:tc>
           <w:tcPr>
             <w:tcW w:type="dxa" w:w="4419"/>
-            <w:tcBorders/>
+            <w:tcBorders>
+              <w:top w:val="none" w:sz="0" w:color="auto" w:space="0"/>
+              <w:bottom w:val="none" w:sz="0" w:color="auto" w:space="0"/>
+              <w:left w:val="none" w:sz="0" w:color="auto" w:space="0"/>
+              <w:right w:val="none" w:sz="0" w:color="auto" w:space="0"/>
+            </w:tcBorders>
           </w:tcPr>
           <w:p>
             <w:pPr>
@@ -3198,7 +3206,12 @@
         <w:tc>
           <w:tcPr>
             <w:tcW w:type="dxa" w:w="4419"/>
-            <w:tcBorders/>
+            <w:tcBorders>
+              <w:top w:val="none" w:sz="0" w:color="auto" w:space="0"/>
+              <w:bottom w:val="none" w:sz="0" w:color="auto" w:space="0"/>
+              <w:left w:val="none" w:sz="0" w:color="auto" w:space="0"/>
+              <w:right w:val="none" w:sz="0" w:color="auto" w:space="0"/>
+            </w:tcBorders>
           </w:tcPr>
           <w:p>
             <w:pPr>
@@ -3222,7 +3235,12 @@
         <w:tc>
           <w:tcPr>
             <w:tcW w:type="dxa" w:w="4419"/>
-            <w:tcBorders/>
+            <w:tcBorders>
+              <w:top w:val="none" w:sz="0" w:color="auto" w:space="0"/>
+              <w:bottom w:val="none" w:sz="0" w:color="auto" w:space="0"/>
+              <w:left w:val="none" w:sz="0" w:color="auto" w:space="0"/>
+              <w:right w:val="none" w:sz="0" w:color="auto" w:space="0"/>
+            </w:tcBorders>
           </w:tcPr>
           <w:p>
             <w:pPr>
@@ -3244,7 +3262,12 @@
         <w:tc>
           <w:tcPr>
             <w:tcW w:type="dxa" w:w="4419"/>
-            <w:tcBorders/>
+            <w:tcBorders>
+              <w:top w:val="none" w:sz="0" w:color="auto" w:space="0"/>
+              <w:bottom w:val="none" w:sz="0" w:color="auto" w:space="0"/>
+              <w:left w:val="none" w:sz="0" w:color="auto" w:space="0"/>
+              <w:right w:val="none" w:sz="0" w:color="auto" w:space="0"/>
+            </w:tcBorders>
           </w:tcPr>
           <w:p>
             <w:pPr>
@@ -3268,7 +3291,12 @@
         <w:tc>
           <w:tcPr>
             <w:tcW w:type="dxa" w:w="4419"/>
-            <w:tcBorders/>
+            <w:tcBorders>
+              <w:top w:val="none" w:sz="0" w:color="auto" w:space="0"/>
+              <w:bottom w:val="none" w:sz="0" w:color="auto" w:space="0"/>
+              <w:left w:val="none" w:sz="0" w:color="auto" w:space="0"/>
+              <w:right w:val="none" w:sz="0" w:color="auto" w:space="0"/>
+            </w:tcBorders>
           </w:tcPr>
           <w:p>
             <w:pPr>
@@ -3290,7 +3318,12 @@
         <w:tc>
           <w:tcPr>
             <w:tcW w:type="dxa" w:w="4419"/>
-            <w:tcBorders/>
+            <w:tcBorders>
+              <w:top w:val="none" w:sz="0" w:color="auto" w:space="0"/>
+              <w:bottom w:val="none" w:sz="0" w:color="auto" w:space="0"/>
+              <w:left w:val="none" w:sz="0" w:color="auto" w:space="0"/>
+              <w:right w:val="none" w:sz="0" w:color="auto" w:space="0"/>
+            </w:tcBorders>
           </w:tcPr>
           <w:p>
             <w:pPr>
@@ -3314,7 +3347,12 @@
         <w:tc>
           <w:tcPr>
             <w:tcW w:type="dxa" w:w="4419"/>
-            <w:tcBorders/>
+            <w:tcBorders>
+              <w:top w:val="none" w:sz="0" w:color="auto" w:space="0"/>
+              <w:bottom w:val="none" w:sz="0" w:color="auto" w:space="0"/>
+              <w:left w:val="none" w:sz="0" w:color="auto" w:space="0"/>
+              <w:right w:val="none" w:sz="0" w:color="auto" w:space="0"/>
+            </w:tcBorders>
           </w:tcPr>
           <w:p>
             <w:pPr>
@@ -3335,7 +3373,12 @@
         <w:tc>
           <w:tcPr>
             <w:tcW w:type="dxa" w:w="4419"/>
-            <w:tcBorders/>
+            <w:tcBorders>
+              <w:top w:val="none" w:sz="0" w:color="auto" w:space="0"/>
+              <w:bottom w:val="none" w:sz="0" w:color="auto" w:space="0"/>
+              <w:left w:val="none" w:sz="0" w:color="auto" w:space="0"/>
+              <w:right w:val="none" w:sz="0" w:color="auto" w:space="0"/>
+            </w:tcBorders>
           </w:tcPr>
           <w:p>
             <w:pPr>
@@ -3358,7 +3401,12 @@
         <w:tc>
           <w:tcPr>
             <w:tcW w:type="dxa" w:w="4419"/>
-            <w:tcBorders/>
+            <w:tcBorders>
+              <w:top w:val="none" w:sz="0" w:color="auto" w:space="0"/>
+              <w:bottom w:val="none" w:sz="0" w:color="auto" w:space="0"/>
+              <w:left w:val="none" w:sz="0" w:color="auto" w:space="0"/>
+              <w:right w:val="none" w:sz="0" w:color="auto" w:space="0"/>
+            </w:tcBorders>
           </w:tcPr>
           <w:p>
             <w:pPr>
@@ -3380,7 +3428,12 @@
         <w:tc>
           <w:tcPr>
             <w:tcW w:type="dxa" w:w="4419"/>
-            <w:tcBorders/>
+            <w:tcBorders>
+              <w:top w:val="none" w:sz="0" w:color="auto" w:space="0"/>
+              <w:bottom w:val="none" w:sz="0" w:color="auto" w:space="0"/>
+              <w:left w:val="none" w:sz="0" w:color="auto" w:space="0"/>
+              <w:right w:val="none" w:sz="0" w:color="auto" w:space="0"/>
+            </w:tcBorders>
           </w:tcPr>
           <w:p>
             <w:pPr>
@@ -3403,7 +3456,12 @@
         <w:tc>
           <w:tcPr>
             <w:tcW w:type="dxa" w:w="4419"/>
-            <w:tcBorders/>
+            <w:tcBorders>
+              <w:top w:val="none" w:sz="0" w:color="auto" w:space="0"/>
+              <w:bottom w:val="none" w:sz="0" w:color="auto" w:space="0"/>
+              <w:left w:val="none" w:sz="0" w:color="auto" w:space="0"/>
+              <w:right w:val="none" w:sz="0" w:color="auto" w:space="0"/>
+            </w:tcBorders>
           </w:tcPr>
           <w:p>
             <w:pPr>
@@ -3425,7 +3483,12 @@
         <w:tc>
           <w:tcPr>
             <w:tcW w:type="dxa" w:w="4419"/>
-            <w:tcBorders/>
+            <w:tcBorders>
+              <w:top w:val="none" w:sz="0" w:color="auto" w:space="0"/>
+              <w:bottom w:val="none" w:sz="0" w:color="auto" w:space="0"/>
+              <w:left w:val="none" w:sz="0" w:color="auto" w:space="0"/>
+              <w:right w:val="none" w:sz="0" w:color="auto" w:space="0"/>
+            </w:tcBorders>
           </w:tcPr>
           <w:p>
             <w:pPr>
@@ -3449,7 +3512,12 @@
         <w:tc>
           <w:tcPr>
             <w:tcW w:type="dxa" w:w="4419"/>
-            <w:tcBorders/>
+            <w:tcBorders>
+              <w:top w:val="none" w:sz="0" w:color="auto" w:space="0"/>
+              <w:bottom w:val="none" w:sz="0" w:color="auto" w:space="0"/>
+              <w:left w:val="none" w:sz="0" w:color="auto" w:space="0"/>
+              <w:right w:val="none" w:sz="0" w:color="auto" w:space="0"/>
+            </w:tcBorders>
           </w:tcPr>
           <w:p>
             <w:pPr>
@@ -3471,7 +3539,12 @@
         <w:tc>
           <w:tcPr>
             <w:tcW w:type="dxa" w:w="4419"/>
-            <w:tcBorders/>
+            <w:tcBorders>
+              <w:top w:val="none" w:sz="0" w:color="auto" w:space="0"/>
+              <w:bottom w:val="none" w:sz="0" w:color="auto" w:space="0"/>
+              <w:left w:val="none" w:sz="0" w:color="auto" w:space="0"/>
+              <w:right w:val="none" w:sz="0" w:color="auto" w:space="0"/>
+            </w:tcBorders>
           </w:tcPr>
           <w:p>
             <w:pPr>
@@ -3495,7 +3568,12 @@
         <w:tc>
           <w:tcPr>
             <w:tcW w:type="dxa" w:w="4419"/>
-            <w:tcBorders/>
+            <w:tcBorders>
+              <w:top w:val="none" w:sz="0" w:color="auto" w:space="0"/>
+              <w:bottom w:val="none" w:sz="0" w:color="auto" w:space="0"/>
+              <w:left w:val="none" w:sz="0" w:color="auto" w:space="0"/>
+              <w:right w:val="none" w:sz="0" w:color="auto" w:space="0"/>
+            </w:tcBorders>
           </w:tcPr>
           <w:p>
             <w:pPr>
@@ -3517,7 +3595,12 @@
         <w:tc>
           <w:tcPr>
             <w:tcW w:type="dxa" w:w="4419"/>
-            <w:tcBorders/>
+            <w:tcBorders>
+              <w:top w:val="none" w:sz="0" w:color="auto" w:space="0"/>
+              <w:bottom w:val="none" w:sz="0" w:color="auto" w:space="0"/>
+              <w:left w:val="none" w:sz="0" w:color="auto" w:space="0"/>
+              <w:right w:val="none" w:sz="0" w:color="auto" w:space="0"/>
+            </w:tcBorders>
           </w:tcPr>
           <w:p>
             <w:pPr>
@@ -3541,7 +3624,12 @@
         <w:tc>
           <w:tcPr>
             <w:tcW w:type="dxa" w:w="4419"/>
-            <w:tcBorders/>
+            <w:tcBorders>
+              <w:top w:val="none" w:sz="0" w:color="auto" w:space="0"/>
+              <w:bottom w:val="none" w:sz="0" w:color="auto" w:space="0"/>
+              <w:left w:val="none" w:sz="0" w:color="auto" w:space="0"/>
+              <w:right w:val="none" w:sz="0" w:color="auto" w:space="0"/>
+            </w:tcBorders>
           </w:tcPr>
           <w:p>
             <w:pPr>
@@ -3562,7 +3650,12 @@
         <w:tc>
           <w:tcPr>
             <w:tcW w:type="dxa" w:w="4419"/>
-            <w:tcBorders/>
+            <w:tcBorders>
+              <w:top w:val="none" w:sz="0" w:color="auto" w:space="0"/>
+              <w:bottom w:val="none" w:sz="0" w:color="auto" w:space="0"/>
+              <w:left w:val="none" w:sz="0" w:color="auto" w:space="0"/>
+              <w:right w:val="none" w:sz="0" w:color="auto" w:space="0"/>
+            </w:tcBorders>
           </w:tcPr>
           <w:p>
             <w:pPr>
@@ -3585,7 +3678,12 @@
         <w:tc>
           <w:tcPr>
             <w:tcW w:type="dxa" w:w="4419"/>
-            <w:tcBorders/>
+            <w:tcBorders>
+              <w:top w:val="none" w:sz="0" w:color="auto" w:space="0"/>
+              <w:bottom w:val="none" w:sz="0" w:color="auto" w:space="0"/>
+              <w:left w:val="none" w:sz="0" w:color="auto" w:space="0"/>
+              <w:right w:val="none" w:sz="0" w:color="auto" w:space="0"/>
+            </w:tcBorders>
           </w:tcPr>
           <w:p>
             <w:pPr>
@@ -3607,7 +3705,12 @@
         <w:tc>
           <w:tcPr>
             <w:tcW w:type="dxa" w:w="4419"/>
-            <w:tcBorders/>
+            <w:tcBorders>
+              <w:top w:val="none" w:sz="0" w:color="auto" w:space="0"/>
+              <w:bottom w:val="none" w:sz="0" w:color="auto" w:space="0"/>
+              <w:left w:val="none" w:sz="0" w:color="auto" w:space="0"/>
+              <w:right w:val="none" w:sz="0" w:color="auto" w:space="0"/>
+            </w:tcBorders>
           </w:tcPr>
           <w:p>
             <w:pPr>
@@ -3630,7 +3733,12 @@
         <w:tc>
           <w:tcPr>
             <w:tcW w:type="dxa" w:w="4419"/>
-            <w:tcBorders/>
+            <w:tcBorders>
+              <w:top w:val="none" w:sz="0" w:color="auto" w:space="0"/>
+              <w:bottom w:val="none" w:sz="0" w:color="auto" w:space="0"/>
+              <w:left w:val="none" w:sz="0" w:color="auto" w:space="0"/>
+              <w:right w:val="none" w:sz="0" w:color="auto" w:space="0"/>
+            </w:tcBorders>
           </w:tcPr>
           <w:p>
             <w:pPr>
@@ -3652,7 +3760,12 @@
         <w:tc>
           <w:tcPr>
             <w:tcW w:type="dxa" w:w="4419"/>
-            <w:tcBorders/>
+            <w:tcBorders>
+              <w:top w:val="none" w:sz="0" w:color="auto" w:space="0"/>
+              <w:bottom w:val="none" w:sz="0" w:color="auto" w:space="0"/>
+              <w:left w:val="none" w:sz="0" w:color="auto" w:space="0"/>
+              <w:right w:val="none" w:sz="0" w:color="auto" w:space="0"/>
+            </w:tcBorders>
           </w:tcPr>
           <w:p>
             <w:pPr>
@@ -3676,7 +3789,12 @@
         <w:tc>
           <w:tcPr>
             <w:tcW w:type="dxa" w:w="4419"/>
-            <w:tcBorders/>
+            <w:tcBorders>
+              <w:top w:val="none" w:sz="0" w:color="auto" w:space="0"/>
+              <w:bottom w:val="none" w:sz="0" w:color="auto" w:space="0"/>
+              <w:left w:val="none" w:sz="0" w:color="auto" w:space="0"/>
+              <w:right w:val="none" w:sz="0" w:color="auto" w:space="0"/>
+            </w:tcBorders>
           </w:tcPr>
           <w:p>
             <w:pPr>
@@ -3698,7 +3816,12 @@
         <w:tc>
           <w:tcPr>
             <w:tcW w:type="dxa" w:w="4419"/>
-            <w:tcBorders/>
+            <w:tcBorders>
+              <w:top w:val="none" w:sz="0" w:color="auto" w:space="0"/>
+              <w:bottom w:val="none" w:sz="0" w:color="auto" w:space="0"/>
+              <w:left w:val="none" w:sz="0" w:color="auto" w:space="0"/>
+              <w:right w:val="none" w:sz="0" w:color="auto" w:space="0"/>
+            </w:tcBorders>
           </w:tcPr>
           <w:p>
             <w:pPr>
@@ -3722,7 +3845,12 @@
         <w:tc>
           <w:tcPr>
             <w:tcW w:type="dxa" w:w="4419"/>
-            <w:tcBorders/>
+            <w:tcBorders>
+              <w:top w:val="none" w:sz="0" w:color="auto" w:space="0"/>
+              <w:bottom w:val="none" w:sz="0" w:color="auto" w:space="0"/>
+              <w:left w:val="none" w:sz="0" w:color="auto" w:space="0"/>
+              <w:right w:val="none" w:sz="0" w:color="auto" w:space="0"/>
+            </w:tcBorders>
           </w:tcPr>
           <w:p>
             <w:pPr>
@@ -3744,7 +3872,12 @@
         <w:tc>
           <w:tcPr>
             <w:tcW w:type="dxa" w:w="4419"/>
-            <w:tcBorders/>
+            <w:tcBorders>
+              <w:top w:val="none" w:sz="0" w:color="auto" w:space="0"/>
+              <w:bottom w:val="none" w:sz="0" w:color="auto" w:space="0"/>
+              <w:left w:val="none" w:sz="0" w:color="auto" w:space="0"/>
+              <w:right w:val="none" w:sz="0" w:color="auto" w:space="0"/>
+            </w:tcBorders>
           </w:tcPr>
           <w:p>
             <w:pPr>
@@ -3768,7 +3901,12 @@
         <w:tc>
           <w:tcPr>
             <w:tcW w:type="dxa" w:w="4419"/>
-            <w:tcBorders/>
+            <w:tcBorders>
+              <w:top w:val="none" w:sz="0" w:color="auto" w:space="0"/>
+              <w:bottom w:val="none" w:sz="0" w:color="auto" w:space="0"/>
+              <w:left w:val="none" w:sz="0" w:color="auto" w:space="0"/>
+              <w:right w:val="none" w:sz="0" w:color="auto" w:space="0"/>
+            </w:tcBorders>
           </w:tcPr>
           <w:p>
             <w:pPr>
@@ -3789,7 +3927,12 @@
         <w:tc>
           <w:tcPr>
             <w:tcW w:type="dxa" w:w="4419"/>
-            <w:tcBorders/>
+            <w:tcBorders>
+              <w:top w:val="none" w:sz="0" w:color="auto" w:space="0"/>
+              <w:bottom w:val="none" w:sz="0" w:color="auto" w:space="0"/>
+              <w:left w:val="none" w:sz="0" w:color="auto" w:space="0"/>
+              <w:right w:val="none" w:sz="0" w:color="auto" w:space="0"/>
+            </w:tcBorders>
           </w:tcPr>
           <w:p>
             <w:pPr>
@@ -3812,7 +3955,12 @@
         <w:tc>
           <w:tcPr>
             <w:tcW w:type="dxa" w:w="4419"/>
-            <w:tcBorders/>
+            <w:tcBorders>
+              <w:top w:val="none" w:sz="0" w:color="auto" w:space="0"/>
+              <w:bottom w:val="none" w:sz="0" w:color="auto" w:space="0"/>
+              <w:left w:val="none" w:sz="0" w:color="auto" w:space="0"/>
+              <w:right w:val="none" w:sz="0" w:color="auto" w:space="0"/>
+            </w:tcBorders>
           </w:tcPr>
           <w:p>
             <w:pPr>
@@ -3834,7 +3982,12 @@
         <w:tc>
           <w:tcPr>
             <w:tcW w:type="dxa" w:w="4419"/>
-            <w:tcBorders/>
+            <w:tcBorders>
+              <w:top w:val="none" w:sz="0" w:color="auto" w:space="0"/>
+              <w:bottom w:val="none" w:sz="0" w:color="auto" w:space="0"/>
+              <w:left w:val="none" w:sz="0" w:color="auto" w:space="0"/>
+              <w:right w:val="none" w:sz="0" w:color="auto" w:space="0"/>
+            </w:tcBorders>
           </w:tcPr>
           <w:p>
             <w:pPr>
@@ -3857,7 +4010,12 @@
         <w:tc>
           <w:tcPr>
             <w:tcW w:type="dxa" w:w="4419"/>
-            <w:tcBorders/>
+            <w:tcBorders>
+              <w:top w:val="none" w:sz="0" w:color="auto" w:space="0"/>
+              <w:bottom w:val="none" w:sz="0" w:color="auto" w:space="0"/>
+              <w:left w:val="none" w:sz="0" w:color="auto" w:space="0"/>
+              <w:right w:val="none" w:sz="0" w:color="auto" w:space="0"/>
+            </w:tcBorders>
           </w:tcPr>
           <w:p>
             <w:pPr>
@@ -3879,7 +4037,12 @@
         <w:tc>
           <w:tcPr>
             <w:tcW w:type="dxa" w:w="4419"/>
-            <w:tcBorders/>
+            <w:tcBorders>
+              <w:top w:val="none" w:sz="0" w:color="auto" w:space="0"/>
+              <w:bottom w:val="none" w:sz="0" w:color="auto" w:space="0"/>
+              <w:left w:val="none" w:sz="0" w:color="auto" w:space="0"/>
+              <w:right w:val="none" w:sz="0" w:color="auto" w:space="0"/>
+            </w:tcBorders>
           </w:tcPr>
           <w:p>
             <w:pPr>
@@ -3903,7 +4066,12 @@
         <w:tc>
           <w:tcPr>
             <w:tcW w:type="dxa" w:w="4419"/>
-            <w:tcBorders/>
+            <w:tcBorders>
+              <w:top w:val="none" w:sz="0" w:color="auto" w:space="0"/>
+              <w:bottom w:val="none" w:sz="0" w:color="auto" w:space="0"/>
+              <w:left w:val="none" w:sz="0" w:color="auto" w:space="0"/>
+              <w:right w:val="none" w:sz="0" w:color="auto" w:space="0"/>
+            </w:tcBorders>
           </w:tcPr>
           <w:p>
             <w:pPr>
@@ -3925,7 +4093,12 @@
         <w:tc>
           <w:tcPr>
             <w:tcW w:type="dxa" w:w="4419"/>
-            <w:tcBorders/>
+            <w:tcBorders>
+              <w:top w:val="none" w:sz="0" w:color="auto" w:space="0"/>
+              <w:bottom w:val="none" w:sz="0" w:color="auto" w:space="0"/>
+              <w:left w:val="none" w:sz="0" w:color="auto" w:space="0"/>
+              <w:right w:val="none" w:sz="0" w:color="auto" w:space="0"/>
+            </w:tcBorders>
           </w:tcPr>
           <w:p>
             <w:pPr>
@@ -3949,7 +4122,12 @@
         <w:tc>
           <w:tcPr>
             <w:tcW w:type="dxa" w:w="4419"/>
-            <w:tcBorders/>
+            <w:tcBorders>
+              <w:top w:val="none" w:sz="0" w:color="auto" w:space="0"/>
+              <w:bottom w:val="none" w:sz="0" w:color="auto" w:space="0"/>
+              <w:left w:val="none" w:sz="0" w:color="auto" w:space="0"/>
+              <w:right w:val="none" w:sz="0" w:color="auto" w:space="0"/>
+            </w:tcBorders>
           </w:tcPr>
           <w:p>
             <w:pPr>
@@ -3971,7 +4149,12 @@
         <w:tc>
           <w:tcPr>
             <w:tcW w:type="dxa" w:w="4419"/>
-            <w:tcBorders/>
+            <w:tcBorders>
+              <w:top w:val="none" w:sz="0" w:color="auto" w:space="0"/>
+              <w:bottom w:val="none" w:sz="0" w:color="auto" w:space="0"/>
+              <w:left w:val="none" w:sz="0" w:color="auto" w:space="0"/>
+              <w:right w:val="none" w:sz="0" w:color="auto" w:space="0"/>
+            </w:tcBorders>
           </w:tcPr>
           <w:p>
             <w:pPr>
@@ -3995,7 +4178,12 @@
         <w:tc>
           <w:tcPr>
             <w:tcW w:type="dxa" w:w="4419"/>
-            <w:tcBorders/>
+            <w:tcBorders>
+              <w:top w:val="none" w:sz="0" w:color="auto" w:space="0"/>
+              <w:bottom w:val="none" w:sz="0" w:color="auto" w:space="0"/>
+              <w:left w:val="none" w:sz="0" w:color="auto" w:space="0"/>
+              <w:right w:val="none" w:sz="0" w:color="auto" w:space="0"/>
+            </w:tcBorders>
           </w:tcPr>
           <w:p>
             <w:pPr>
@@ -4017,7 +4205,12 @@
         <w:tc>
           <w:tcPr>
             <w:tcW w:type="dxa" w:w="4419"/>
-            <w:tcBorders/>
+            <w:tcBorders>
+              <w:top w:val="none" w:sz="0" w:color="auto" w:space="0"/>
+              <w:bottom w:val="none" w:sz="0" w:color="auto" w:space="0"/>
+              <w:left w:val="none" w:sz="0" w:color="auto" w:space="0"/>
+              <w:right w:val="none" w:sz="0" w:color="auto" w:space="0"/>
+            </w:tcBorders>
           </w:tcPr>
           <w:p>
             <w:pPr>
@@ -4041,7 +4234,12 @@
         <w:tc>
           <w:tcPr>
             <w:tcW w:type="dxa" w:w="4419"/>
-            <w:tcBorders/>
+            <w:tcBorders>
+              <w:top w:val="none" w:sz="0" w:color="auto" w:space="0"/>
+              <w:bottom w:val="none" w:sz="0" w:color="auto" w:space="0"/>
+              <w:left w:val="none" w:sz="0" w:color="auto" w:space="0"/>
+              <w:right w:val="none" w:sz="0" w:color="auto" w:space="0"/>
+            </w:tcBorders>
           </w:tcPr>
           <w:p>
             <w:pPr>
@@ -4063,7 +4261,12 @@
         <w:tc>
           <w:tcPr>
             <w:tcW w:type="dxa" w:w="4419"/>
-            <w:tcBorders/>
+            <w:tcBorders>
+              <w:top w:val="none" w:sz="0" w:color="auto" w:space="0"/>
+              <w:bottom w:val="none" w:sz="0" w:color="auto" w:space="0"/>
+              <w:left w:val="none" w:sz="0" w:color="auto" w:space="0"/>
+              <w:right w:val="none" w:sz="0" w:color="auto" w:space="0"/>
+            </w:tcBorders>
           </w:tcPr>
           <w:p>
             <w:pPr>
@@ -4087,7 +4290,12 @@
         <w:tc>
           <w:tcPr>
             <w:tcW w:type="dxa" w:w="4419"/>
-            <w:tcBorders/>
+            <w:tcBorders>
+              <w:top w:val="none" w:sz="0" w:color="auto" w:space="0"/>
+              <w:bottom w:val="none" w:sz="0" w:color="auto" w:space="0"/>
+              <w:left w:val="none" w:sz="0" w:color="auto" w:space="0"/>
+              <w:right w:val="none" w:sz="0" w:color="auto" w:space="0"/>
+            </w:tcBorders>
           </w:tcPr>
           <w:p>
             <w:pPr>
@@ -4109,7 +4317,12 @@
         <w:tc>
           <w:tcPr>
             <w:tcW w:type="dxa" w:w="4419"/>
-            <w:tcBorders/>
+            <w:tcBorders>
+              <w:top w:val="none" w:sz="0" w:color="auto" w:space="0"/>
+              <w:bottom w:val="none" w:sz="0" w:color="auto" w:space="0"/>
+              <w:left w:val="none" w:sz="0" w:color="auto" w:space="0"/>
+              <w:right w:val="none" w:sz="0" w:color="auto" w:space="0"/>
+            </w:tcBorders>
           </w:tcPr>
           <w:p>
             <w:pPr>
@@ -4133,7 +4346,12 @@
         <w:tc>
           <w:tcPr>
             <w:tcW w:type="dxa" w:w="4419"/>
-            <w:tcBorders/>
+            <w:tcBorders>
+              <w:top w:val="none" w:sz="0" w:color="auto" w:space="0"/>
+              <w:bottom w:val="none" w:sz="0" w:color="auto" w:space="0"/>
+              <w:left w:val="none" w:sz="0" w:color="auto" w:space="0"/>
+              <w:right w:val="none" w:sz="0" w:color="auto" w:space="0"/>
+            </w:tcBorders>
           </w:tcPr>
           <w:p>
             <w:pPr>
@@ -4155,7 +4373,12 @@
         <w:tc>
           <w:tcPr>
             <w:tcW w:type="dxa" w:w="4419"/>
-            <w:tcBorders/>
+            <w:tcBorders>
+              <w:top w:val="none" w:sz="0" w:color="auto" w:space="0"/>
+              <w:bottom w:val="none" w:sz="0" w:color="auto" w:space="0"/>
+              <w:left w:val="none" w:sz="0" w:color="auto" w:space="0"/>
+              <w:right w:val="none" w:sz="0" w:color="auto" w:space="0"/>
+            </w:tcBorders>
           </w:tcPr>
           <w:p>
             <w:pPr>
@@ -4179,7 +4402,12 @@
         <w:tc>
           <w:tcPr>
             <w:tcW w:type="dxa" w:w="4419"/>
-            <w:tcBorders/>
+            <w:tcBorders>
+              <w:top w:val="none" w:sz="0" w:color="auto" w:space="0"/>
+              <w:bottom w:val="none" w:sz="0" w:color="auto" w:space="0"/>
+              <w:left w:val="none" w:sz="0" w:color="auto" w:space="0"/>
+              <w:right w:val="none" w:sz="0" w:color="auto" w:space="0"/>
+            </w:tcBorders>
           </w:tcPr>
           <w:p>
             <w:pPr>
@@ -4201,7 +4429,12 @@
         <w:tc>
           <w:tcPr>
             <w:tcW w:type="dxa" w:w="4419"/>
-            <w:tcBorders/>
+            <w:tcBorders>
+              <w:top w:val="none" w:sz="0" w:color="auto" w:space="0"/>
+              <w:bottom w:val="none" w:sz="0" w:color="auto" w:space="0"/>
+              <w:left w:val="none" w:sz="0" w:color="auto" w:space="0"/>
+              <w:right w:val="none" w:sz="0" w:color="auto" w:space="0"/>
+            </w:tcBorders>
           </w:tcPr>
           <w:p>
             <w:pPr>
@@ -4225,7 +4458,12 @@
         <w:tc>
           <w:tcPr>
             <w:tcW w:type="dxa" w:w="4419"/>
-            <w:tcBorders/>
+            <w:tcBorders>
+              <w:top w:val="none" w:sz="0" w:color="auto" w:space="0"/>
+              <w:bottom w:val="none" w:sz="0" w:color="auto" w:space="0"/>
+              <w:left w:val="none" w:sz="0" w:color="auto" w:space="0"/>
+              <w:right w:val="none" w:sz="0" w:color="auto" w:space="0"/>
+            </w:tcBorders>
           </w:tcPr>
           <w:p>
             <w:pPr>
@@ -4247,7 +4485,12 @@
         <w:tc>
           <w:tcPr>
             <w:tcW w:type="dxa" w:w="4419"/>
-            <w:tcBorders/>
+            <w:tcBorders>
+              <w:top w:val="none" w:sz="0" w:color="auto" w:space="0"/>
+              <w:bottom w:val="none" w:sz="0" w:color="auto" w:space="0"/>
+              <w:left w:val="none" w:sz="0" w:color="auto" w:space="0"/>
+              <w:right w:val="none" w:sz="0" w:color="auto" w:space="0"/>
+            </w:tcBorders>
           </w:tcPr>
           <w:p>
             <w:pPr>
@@ -4271,7 +4514,12 @@
         <w:tc>
           <w:tcPr>
             <w:tcW w:type="dxa" w:w="4419"/>
-            <w:tcBorders/>
+            <w:tcBorders>
+              <w:top w:val="none" w:sz="0" w:color="auto" w:space="0"/>
+              <w:bottom w:val="none" w:sz="0" w:color="auto" w:space="0"/>
+              <w:left w:val="none" w:sz="0" w:color="auto" w:space="0"/>
+              <w:right w:val="none" w:sz="0" w:color="auto" w:space="0"/>
+            </w:tcBorders>
           </w:tcPr>
           <w:p>
             <w:pPr>
@@ -4292,7 +4540,12 @@
         <w:tc>
           <w:tcPr>
             <w:tcW w:type="dxa" w:w="4419"/>
-            <w:tcBorders/>
+            <w:tcBorders>
+              <w:top w:val="none" w:sz="0" w:color="auto" w:space="0"/>
+              <w:bottom w:val="none" w:sz="0" w:color="auto" w:space="0"/>
+              <w:left w:val="none" w:sz="0" w:color="auto" w:space="0"/>
+              <w:right w:val="none" w:sz="0" w:color="auto" w:space="0"/>
+            </w:tcBorders>
           </w:tcPr>
           <w:p>
             <w:pPr>
@@ -4315,7 +4568,12 @@
         <w:tc>
           <w:tcPr>
             <w:tcW w:type="dxa" w:w="4419"/>
-            <w:tcBorders/>
+            <w:tcBorders>
+              <w:top w:val="none" w:sz="0" w:color="auto" w:space="0"/>
+              <w:bottom w:val="none" w:sz="0" w:color="auto" w:space="0"/>
+              <w:left w:val="none" w:sz="0" w:color="auto" w:space="0"/>
+              <w:right w:val="none" w:sz="0" w:color="auto" w:space="0"/>
+            </w:tcBorders>
           </w:tcPr>
           <w:p>
             <w:pPr>
@@ -4337,7 +4595,12 @@
         <w:tc>
           <w:tcPr>
             <w:tcW w:type="dxa" w:w="4419"/>
-            <w:tcBorders/>
+            <w:tcBorders>
+              <w:top w:val="none" w:sz="0" w:color="auto" w:space="0"/>
+              <w:bottom w:val="none" w:sz="0" w:color="auto" w:space="0"/>
+              <w:left w:val="none" w:sz="0" w:color="auto" w:space="0"/>
+              <w:right w:val="none" w:sz="0" w:color="auto" w:space="0"/>
+            </w:tcBorders>
           </w:tcPr>
           <w:p>
             <w:pPr>
@@ -4360,7 +4623,12 @@
         <w:tc>
           <w:tcPr>
             <w:tcW w:type="dxa" w:w="4419"/>
-            <w:tcBorders/>
+            <w:tcBorders>
+              <w:top w:val="none" w:sz="0" w:color="auto" w:space="0"/>
+              <w:bottom w:val="none" w:sz="0" w:color="auto" w:space="0"/>
+              <w:left w:val="none" w:sz="0" w:color="auto" w:space="0"/>
+              <w:right w:val="none" w:sz="0" w:color="auto" w:space="0"/>
+            </w:tcBorders>
           </w:tcPr>
           <w:p>
             <w:pPr>
@@ -4382,7 +4650,12 @@
         <w:tc>
           <w:tcPr>
             <w:tcW w:type="dxa" w:w="4419"/>
-            <w:tcBorders/>
+            <w:tcBorders>
+              <w:top w:val="none" w:sz="0" w:color="auto" w:space="0"/>
+              <w:bottom w:val="none" w:sz="0" w:color="auto" w:space="0"/>
+              <w:left w:val="none" w:sz="0" w:color="auto" w:space="0"/>
+              <w:right w:val="none" w:sz="0" w:color="auto" w:space="0"/>
+            </w:tcBorders>
           </w:tcPr>
           <w:p>
             <w:pPr>
@@ -4406,7 +4679,12 @@
         <w:tc>
           <w:tcPr>
             <w:tcW w:type="dxa" w:w="4419"/>
-            <w:tcBorders/>
+            <w:tcBorders>
+              <w:top w:val="none" w:sz="0" w:color="auto" w:space="0"/>
+              <w:bottom w:val="none" w:sz="0" w:color="auto" w:space="0"/>
+              <w:left w:val="none" w:sz="0" w:color="auto" w:space="0"/>
+              <w:right w:val="none" w:sz="0" w:color="auto" w:space="0"/>
+            </w:tcBorders>
           </w:tcPr>
           <w:p>
             <w:pPr>
@@ -4428,7 +4706,12 @@
         <w:tc>
           <w:tcPr>
             <w:tcW w:type="dxa" w:w="4419"/>
-            <w:tcBorders/>
+            <w:tcBorders>
+              <w:top w:val="none" w:sz="0" w:color="auto" w:space="0"/>
+              <w:bottom w:val="none" w:sz="0" w:color="auto" w:space="0"/>
+              <w:left w:val="none" w:sz="0" w:color="auto" w:space="0"/>
+              <w:right w:val="none" w:sz="0" w:color="auto" w:space="0"/>
+            </w:tcBorders>
           </w:tcPr>
           <w:p>
             <w:pPr>
@@ -4452,7 +4735,12 @@
         <w:tc>
           <w:tcPr>
             <w:tcW w:type="dxa" w:w="4419"/>
-            <w:tcBorders/>
+            <w:tcBorders>
+              <w:top w:val="none" w:sz="0" w:color="auto" w:space="0"/>
+              <w:bottom w:val="none" w:sz="0" w:color="auto" w:space="0"/>
+              <w:left w:val="none" w:sz="0" w:color="auto" w:space="0"/>
+              <w:right w:val="none" w:sz="0" w:color="auto" w:space="0"/>
+            </w:tcBorders>
           </w:tcPr>
           <w:p>
             <w:pPr>
@@ -4474,7 +4762,12 @@
         <w:tc>
           <w:tcPr>
             <w:tcW w:type="dxa" w:w="4419"/>
-            <w:tcBorders/>
+            <w:tcBorders>
+              <w:top w:val="none" w:sz="0" w:color="auto" w:space="0"/>
+              <w:bottom w:val="none" w:sz="0" w:color="auto" w:space="0"/>
+              <w:left w:val="none" w:sz="0" w:color="auto" w:space="0"/>
+              <w:right w:val="none" w:sz="0" w:color="auto" w:space="0"/>
+            </w:tcBorders>
           </w:tcPr>
           <w:p>
             <w:pPr>
@@ -4498,7 +4791,12 @@
         <w:tc>
           <w:tcPr>
             <w:tcW w:type="dxa" w:w="4419"/>
-            <w:tcBorders/>
+            <w:tcBorders>
+              <w:top w:val="none" w:sz="0" w:color="auto" w:space="0"/>
+              <w:bottom w:val="none" w:sz="0" w:color="auto" w:space="0"/>
+              <w:left w:val="none" w:sz="0" w:color="auto" w:space="0"/>
+              <w:right w:val="none" w:sz="0" w:color="auto" w:space="0"/>
+            </w:tcBorders>
           </w:tcPr>
           <w:p>
             <w:pPr>
@@ -4520,7 +4818,12 @@
         <w:tc>
           <w:tcPr>
             <w:tcW w:type="dxa" w:w="4419"/>
-            <w:tcBorders/>
+            <w:tcBorders>
+              <w:top w:val="none" w:sz="0" w:color="auto" w:space="0"/>
+              <w:bottom w:val="none" w:sz="0" w:color="auto" w:space="0"/>
+              <w:left w:val="none" w:sz="0" w:color="auto" w:space="0"/>
+              <w:right w:val="none" w:sz="0" w:color="auto" w:space="0"/>
+            </w:tcBorders>
           </w:tcPr>
           <w:p>
             <w:pPr>
@@ -4544,7 +4847,12 @@
         <w:tc>
           <w:tcPr>
             <w:tcW w:type="dxa" w:w="4419"/>
-            <w:tcBorders/>
+            <w:tcBorders>
+              <w:top w:val="none" w:sz="0" w:color="auto" w:space="0"/>
+              <w:bottom w:val="none" w:sz="0" w:color="auto" w:space="0"/>
+              <w:left w:val="none" w:sz="0" w:color="auto" w:space="0"/>
+              <w:right w:val="none" w:sz="0" w:color="auto" w:space="0"/>
+            </w:tcBorders>
           </w:tcPr>
           <w:p>
             <w:pPr>
@@ -4566,7 +4874,12 @@
         <w:tc>
           <w:tcPr>
             <w:tcW w:type="dxa" w:w="4419"/>
-            <w:tcBorders/>
+            <w:tcBorders>
+              <w:top w:val="none" w:sz="0" w:color="auto" w:space="0"/>
+              <w:bottom w:val="none" w:sz="0" w:color="auto" w:space="0"/>
+              <w:left w:val="none" w:sz="0" w:color="auto" w:space="0"/>
+              <w:right w:val="none" w:sz="0" w:color="auto" w:space="0"/>
+            </w:tcBorders>
           </w:tcPr>
           <w:p>
             <w:pPr>
@@ -4590,7 +4903,12 @@
         <w:tc>
           <w:tcPr>
             <w:tcW w:type="dxa" w:w="4419"/>
-            <w:tcBorders/>
+            <w:tcBorders>
+              <w:top w:val="none" w:sz="0" w:color="auto" w:space="0"/>
+              <w:bottom w:val="none" w:sz="0" w:color="auto" w:space="0"/>
+              <w:left w:val="none" w:sz="0" w:color="auto" w:space="0"/>
+              <w:right w:val="none" w:sz="0" w:color="auto" w:space="0"/>
+            </w:tcBorders>
           </w:tcPr>
           <w:p>
             <w:pPr>
@@ -4612,7 +4930,12 @@
         <w:tc>
           <w:tcPr>
             <w:tcW w:type="dxa" w:w="4419"/>
-            <w:tcBorders/>
+            <w:tcBorders>
+              <w:top w:val="none" w:sz="0" w:color="auto" w:space="0"/>
+              <w:bottom w:val="none" w:sz="0" w:color="auto" w:space="0"/>
+              <w:left w:val="none" w:sz="0" w:color="auto" w:space="0"/>
+              <w:right w:val="none" w:sz="0" w:color="auto" w:space="0"/>
+            </w:tcBorders>
           </w:tcPr>
           <w:p>
             <w:pPr>
@@ -4636,7 +4959,12 @@
         <w:tc>
           <w:tcPr>
             <w:tcW w:type="dxa" w:w="4419"/>
-            <w:tcBorders/>
+            <w:tcBorders>
+              <w:top w:val="none" w:sz="0" w:color="auto" w:space="0"/>
+              <w:bottom w:val="none" w:sz="0" w:color="auto" w:space="0"/>
+              <w:left w:val="none" w:sz="0" w:color="auto" w:space="0"/>
+              <w:right w:val="none" w:sz="0" w:color="auto" w:space="0"/>
+            </w:tcBorders>
           </w:tcPr>
           <w:p>
             <w:pPr>
@@ -4657,7 +4985,12 @@
         <w:tc>
           <w:tcPr>
             <w:tcW w:type="dxa" w:w="4419"/>
-            <w:tcBorders/>
+            <w:tcBorders>
+              <w:top w:val="none" w:sz="0" w:color="auto" w:space="0"/>
+              <w:bottom w:val="none" w:sz="0" w:color="auto" w:space="0"/>
+              <w:left w:val="none" w:sz="0" w:color="auto" w:space="0"/>
+              <w:right w:val="none" w:sz="0" w:color="auto" w:space="0"/>
+            </w:tcBorders>
           </w:tcPr>
           <w:p>
             <w:pPr>
@@ -4680,7 +5013,12 @@
         <w:tc>
           <w:tcPr>
             <w:tcW w:type="dxa" w:w="4419"/>
-            <w:tcBorders/>
+            <w:tcBorders>
+              <w:top w:val="none" w:sz="0" w:color="auto" w:space="0"/>
+              <w:bottom w:val="none" w:sz="0" w:color="auto" w:space="0"/>
+              <w:left w:val="none" w:sz="0" w:color="auto" w:space="0"/>
+              <w:right w:val="none" w:sz="0" w:color="auto" w:space="0"/>
+            </w:tcBorders>
           </w:tcPr>
           <w:p>
             <w:pPr>
@@ -4702,7 +5040,12 @@
         <w:tc>
           <w:tcPr>
             <w:tcW w:type="dxa" w:w="4419"/>
-            <w:tcBorders/>
+            <w:tcBorders>
+              <w:top w:val="none" w:sz="0" w:color="auto" w:space="0"/>
+              <w:bottom w:val="none" w:sz="0" w:color="auto" w:space="0"/>
+              <w:left w:val="none" w:sz="0" w:color="auto" w:space="0"/>
+              <w:right w:val="none" w:sz="0" w:color="auto" w:space="0"/>
+            </w:tcBorders>
           </w:tcPr>
           <w:p>
             <w:pPr>
@@ -4725,7 +5068,12 @@
         <w:tc>
           <w:tcPr>
             <w:tcW w:type="dxa" w:w="4419"/>
-            <w:tcBorders/>
+            <w:tcBorders>
+              <w:top w:val="none" w:sz="0" w:color="auto" w:space="0"/>
+              <w:bottom w:val="none" w:sz="0" w:color="auto" w:space="0"/>
+              <w:left w:val="none" w:sz="0" w:color="auto" w:space="0"/>
+              <w:right w:val="none" w:sz="0" w:color="auto" w:space="0"/>
+            </w:tcBorders>
           </w:tcPr>
           <w:p>
             <w:pPr>
@@ -4747,7 +5095,12 @@
         <w:tc>
           <w:tcPr>
             <w:tcW w:type="dxa" w:w="4419"/>
-            <w:tcBorders/>
+            <w:tcBorders>
+              <w:top w:val="none" w:sz="0" w:color="auto" w:space="0"/>
+              <w:bottom w:val="none" w:sz="0" w:color="auto" w:space="0"/>
+              <w:left w:val="none" w:sz="0" w:color="auto" w:space="0"/>
+              <w:right w:val="none" w:sz="0" w:color="auto" w:space="0"/>
+            </w:tcBorders>
           </w:tcPr>
           <w:p>
             <w:pPr>
@@ -4772,7 +5125,10 @@
           <w:tcPr>
             <w:tcW w:type="dxa" w:w="4419"/>
             <w:tcBorders>
+              <w:top w:val="none" w:sz="0" w:color="auto" w:space="0"/>
               <w:bottom w:val="single" w:sz="8" w:color="000000" w:space="0"/>
+              <w:left w:val="none" w:sz="0" w:color="auto" w:space="0"/>
+              <w:right w:val="none" w:sz="0" w:color="auto" w:space="0"/>
             </w:tcBorders>
           </w:tcPr>
           <w:p>
@@ -4796,7 +5152,10 @@
           <w:tcPr>
             <w:tcW w:type="dxa" w:w="4419"/>
             <w:tcBorders>
+              <w:top w:val="none" w:sz="0" w:color="auto" w:space="0"/>
               <w:bottom w:val="single" w:sz="8" w:color="000000" w:space="0"/>
+              <w:left w:val="none" w:sz="0" w:color="auto" w:space="0"/>
+              <w:right w:val="none" w:sz="0" w:color="auto" w:space="0"/>
             </w:tcBorders>
           </w:tcPr>
           <w:p>
@@ -4849,7 +5208,6 @@
     </w:p>
     <w:tbl>
       <w:tblPr>
-        <w:tblStyle w:val="TableGrid"/>
         <w:tblW w:type="auto" w:w="0"/>
         <w:tblLook w:firstColumn="1" w:firstRow="1" w:lastColumn="0" w:lastRow="0" w:noHBand="0" w:noVBand="1" w:val="04A0"/>
         <w:tblBorders>
@@ -4873,6 +5231,8 @@
             <w:tcBorders>
               <w:top w:val="single" w:sz="8" w:color="000000" w:space="0"/>
               <w:bottom w:val="single" w:sz="4" w:color="000000" w:space="0"/>
+              <w:left w:val="none" w:sz="0" w:color="auto" w:space="0"/>
+              <w:right w:val="none" w:sz="0" w:color="auto" w:space="0"/>
             </w:tcBorders>
           </w:tcPr>
           <w:p>
@@ -4898,6 +5258,8 @@
             <w:tcBorders>
               <w:top w:val="single" w:sz="8" w:color="000000" w:space="0"/>
               <w:bottom w:val="single" w:sz="4" w:color="000000" w:space="0"/>
+              <w:left w:val="none" w:sz="0" w:color="auto" w:space="0"/>
+              <w:right w:val="none" w:sz="0" w:color="auto" w:space="0"/>
             </w:tcBorders>
           </w:tcPr>
           <w:p>
@@ -4923,6 +5285,8 @@
             <w:tcBorders>
               <w:top w:val="single" w:sz="8" w:color="000000" w:space="0"/>
               <w:bottom w:val="single" w:sz="4" w:color="000000" w:space="0"/>
+              <w:left w:val="none" w:sz="0" w:color="auto" w:space="0"/>
+              <w:right w:val="none" w:sz="0" w:color="auto" w:space="0"/>
             </w:tcBorders>
           </w:tcPr>
           <w:p>
@@ -4947,7 +5311,12 @@
         <w:tc>
           <w:tcPr>
             <w:tcW w:type="dxa" w:w="2946"/>
-            <w:tcBorders/>
+            <w:tcBorders>
+              <w:top w:val="none" w:sz="0" w:color="auto" w:space="0"/>
+              <w:bottom w:val="none" w:sz="0" w:color="auto" w:space="0"/>
+              <w:left w:val="none" w:sz="0" w:color="auto" w:space="0"/>
+              <w:right w:val="none" w:sz="0" w:color="auto" w:space="0"/>
+            </w:tcBorders>
           </w:tcPr>
           <w:p>
             <w:pPr>
@@ -4969,7 +5338,12 @@
         <w:tc>
           <w:tcPr>
             <w:tcW w:type="dxa" w:w="2946"/>
-            <w:tcBorders/>
+            <w:tcBorders>
+              <w:top w:val="none" w:sz="0" w:color="auto" w:space="0"/>
+              <w:bottom w:val="none" w:sz="0" w:color="auto" w:space="0"/>
+              <w:left w:val="none" w:sz="0" w:color="auto" w:space="0"/>
+              <w:right w:val="none" w:sz="0" w:color="auto" w:space="0"/>
+            </w:tcBorders>
           </w:tcPr>
           <w:p>
             <w:pPr>
@@ -4991,7 +5365,12 @@
         <w:tc>
           <w:tcPr>
             <w:tcW w:type="dxa" w:w="2946"/>
-            <w:tcBorders/>
+            <w:tcBorders>
+              <w:top w:val="none" w:sz="0" w:color="auto" w:space="0"/>
+              <w:bottom w:val="none" w:sz="0" w:color="auto" w:space="0"/>
+              <w:left w:val="none" w:sz="0" w:color="auto" w:space="0"/>
+              <w:right w:val="none" w:sz="0" w:color="auto" w:space="0"/>
+            </w:tcBorders>
           </w:tcPr>
           <w:p>
             <w:pPr>
@@ -5015,7 +5394,12 @@
         <w:tc>
           <w:tcPr>
             <w:tcW w:type="dxa" w:w="2946"/>
-            <w:tcBorders/>
+            <w:tcBorders>
+              <w:top w:val="none" w:sz="0" w:color="auto" w:space="0"/>
+              <w:bottom w:val="none" w:sz="0" w:color="auto" w:space="0"/>
+              <w:left w:val="none" w:sz="0" w:color="auto" w:space="0"/>
+              <w:right w:val="none" w:sz="0" w:color="auto" w:space="0"/>
+            </w:tcBorders>
           </w:tcPr>
           <w:p>
             <w:pPr>
@@ -5037,7 +5421,12 @@
         <w:tc>
           <w:tcPr>
             <w:tcW w:type="dxa" w:w="2946"/>
-            <w:tcBorders/>
+            <w:tcBorders>
+              <w:top w:val="none" w:sz="0" w:color="auto" w:space="0"/>
+              <w:bottom w:val="none" w:sz="0" w:color="auto" w:space="0"/>
+              <w:left w:val="none" w:sz="0" w:color="auto" w:space="0"/>
+              <w:right w:val="none" w:sz="0" w:color="auto" w:space="0"/>
+            </w:tcBorders>
           </w:tcPr>
           <w:p>
             <w:pPr>
@@ -5059,7 +5448,12 @@
         <w:tc>
           <w:tcPr>
             <w:tcW w:type="dxa" w:w="2946"/>
-            <w:tcBorders/>
+            <w:tcBorders>
+              <w:top w:val="none" w:sz="0" w:color="auto" w:space="0"/>
+              <w:bottom w:val="none" w:sz="0" w:color="auto" w:space="0"/>
+              <w:left w:val="none" w:sz="0" w:color="auto" w:space="0"/>
+              <w:right w:val="none" w:sz="0" w:color="auto" w:space="0"/>
+            </w:tcBorders>
           </w:tcPr>
           <w:p>
             <w:pPr>
@@ -5083,7 +5477,12 @@
         <w:tc>
           <w:tcPr>
             <w:tcW w:type="dxa" w:w="2946"/>
-            <w:tcBorders/>
+            <w:tcBorders>
+              <w:top w:val="none" w:sz="0" w:color="auto" w:space="0"/>
+              <w:bottom w:val="none" w:sz="0" w:color="auto" w:space="0"/>
+              <w:left w:val="none" w:sz="0" w:color="auto" w:space="0"/>
+              <w:right w:val="none" w:sz="0" w:color="auto" w:space="0"/>
+            </w:tcBorders>
           </w:tcPr>
           <w:p>
             <w:pPr>
@@ -5105,7 +5504,12 @@
         <w:tc>
           <w:tcPr>
             <w:tcW w:type="dxa" w:w="2946"/>
-            <w:tcBorders/>
+            <w:tcBorders>
+              <w:top w:val="none" w:sz="0" w:color="auto" w:space="0"/>
+              <w:bottom w:val="none" w:sz="0" w:color="auto" w:space="0"/>
+              <w:left w:val="none" w:sz="0" w:color="auto" w:space="0"/>
+              <w:right w:val="none" w:sz="0" w:color="auto" w:space="0"/>
+            </w:tcBorders>
           </w:tcPr>
           <w:p>
             <w:pPr>
@@ -5127,7 +5531,12 @@
         <w:tc>
           <w:tcPr>
             <w:tcW w:type="dxa" w:w="2946"/>
-            <w:tcBorders/>
+            <w:tcBorders>
+              <w:top w:val="none" w:sz="0" w:color="auto" w:space="0"/>
+              <w:bottom w:val="none" w:sz="0" w:color="auto" w:space="0"/>
+              <w:left w:val="none" w:sz="0" w:color="auto" w:space="0"/>
+              <w:right w:val="none" w:sz="0" w:color="auto" w:space="0"/>
+            </w:tcBorders>
           </w:tcPr>
           <w:p>
             <w:pPr>
@@ -5151,7 +5560,12 @@
         <w:tc>
           <w:tcPr>
             <w:tcW w:type="dxa" w:w="2946"/>
-            <w:tcBorders/>
+            <w:tcBorders>
+              <w:top w:val="none" w:sz="0" w:color="auto" w:space="0"/>
+              <w:bottom w:val="none" w:sz="0" w:color="auto" w:space="0"/>
+              <w:left w:val="none" w:sz="0" w:color="auto" w:space="0"/>
+              <w:right w:val="none" w:sz="0" w:color="auto" w:space="0"/>
+            </w:tcBorders>
           </w:tcPr>
           <w:p>
             <w:pPr>
@@ -5173,7 +5587,12 @@
         <w:tc>
           <w:tcPr>
             <w:tcW w:type="dxa" w:w="2946"/>
-            <w:tcBorders/>
+            <w:tcBorders>
+              <w:top w:val="none" w:sz="0" w:color="auto" w:space="0"/>
+              <w:bottom w:val="none" w:sz="0" w:color="auto" w:space="0"/>
+              <w:left w:val="none" w:sz="0" w:color="auto" w:space="0"/>
+              <w:right w:val="none" w:sz="0" w:color="auto" w:space="0"/>
+            </w:tcBorders>
           </w:tcPr>
           <w:p>
             <w:pPr>
@@ -5195,7 +5614,12 @@
         <w:tc>
           <w:tcPr>
             <w:tcW w:type="dxa" w:w="2946"/>
-            <w:tcBorders/>
+            <w:tcBorders>
+              <w:top w:val="none" w:sz="0" w:color="auto" w:space="0"/>
+              <w:bottom w:val="none" w:sz="0" w:color="auto" w:space="0"/>
+              <w:left w:val="none" w:sz="0" w:color="auto" w:space="0"/>
+              <w:right w:val="none" w:sz="0" w:color="auto" w:space="0"/>
+            </w:tcBorders>
           </w:tcPr>
           <w:p>
             <w:pPr>
@@ -5219,7 +5643,12 @@
         <w:tc>
           <w:tcPr>
             <w:tcW w:type="dxa" w:w="2946"/>
-            <w:tcBorders/>
+            <w:tcBorders>
+              <w:top w:val="none" w:sz="0" w:color="auto" w:space="0"/>
+              <w:bottom w:val="none" w:sz="0" w:color="auto" w:space="0"/>
+              <w:left w:val="none" w:sz="0" w:color="auto" w:space="0"/>
+              <w:right w:val="none" w:sz="0" w:color="auto" w:space="0"/>
+            </w:tcBorders>
           </w:tcPr>
           <w:p>
             <w:pPr>
@@ -5241,7 +5670,12 @@
         <w:tc>
           <w:tcPr>
             <w:tcW w:type="dxa" w:w="2946"/>
-            <w:tcBorders/>
+            <w:tcBorders>
+              <w:top w:val="none" w:sz="0" w:color="auto" w:space="0"/>
+              <w:bottom w:val="none" w:sz="0" w:color="auto" w:space="0"/>
+              <w:left w:val="none" w:sz="0" w:color="auto" w:space="0"/>
+              <w:right w:val="none" w:sz="0" w:color="auto" w:space="0"/>
+            </w:tcBorders>
           </w:tcPr>
           <w:p>
             <w:pPr>
@@ -5263,7 +5697,12 @@
         <w:tc>
           <w:tcPr>
             <w:tcW w:type="dxa" w:w="2946"/>
-            <w:tcBorders/>
+            <w:tcBorders>
+              <w:top w:val="none" w:sz="0" w:color="auto" w:space="0"/>
+              <w:bottom w:val="none" w:sz="0" w:color="auto" w:space="0"/>
+              <w:left w:val="none" w:sz="0" w:color="auto" w:space="0"/>
+              <w:right w:val="none" w:sz="0" w:color="auto" w:space="0"/>
+            </w:tcBorders>
           </w:tcPr>
           <w:p>
             <w:pPr>
@@ -5287,7 +5726,12 @@
         <w:tc>
           <w:tcPr>
             <w:tcW w:type="dxa" w:w="2946"/>
-            <w:tcBorders/>
+            <w:tcBorders>
+              <w:top w:val="none" w:sz="0" w:color="auto" w:space="0"/>
+              <w:bottom w:val="none" w:sz="0" w:color="auto" w:space="0"/>
+              <w:left w:val="none" w:sz="0" w:color="auto" w:space="0"/>
+              <w:right w:val="none" w:sz="0" w:color="auto" w:space="0"/>
+            </w:tcBorders>
           </w:tcPr>
           <w:p>
             <w:pPr>
@@ -5309,7 +5753,12 @@
         <w:tc>
           <w:tcPr>
             <w:tcW w:type="dxa" w:w="2946"/>
-            <w:tcBorders/>
+            <w:tcBorders>
+              <w:top w:val="none" w:sz="0" w:color="auto" w:space="0"/>
+              <w:bottom w:val="none" w:sz="0" w:color="auto" w:space="0"/>
+              <w:left w:val="none" w:sz="0" w:color="auto" w:space="0"/>
+              <w:right w:val="none" w:sz="0" w:color="auto" w:space="0"/>
+            </w:tcBorders>
           </w:tcPr>
           <w:p>
             <w:pPr>
@@ -5331,7 +5780,12 @@
         <w:tc>
           <w:tcPr>
             <w:tcW w:type="dxa" w:w="2946"/>
-            <w:tcBorders/>
+            <w:tcBorders>
+              <w:top w:val="none" w:sz="0" w:color="auto" w:space="0"/>
+              <w:bottom w:val="none" w:sz="0" w:color="auto" w:space="0"/>
+              <w:left w:val="none" w:sz="0" w:color="auto" w:space="0"/>
+              <w:right w:val="none" w:sz="0" w:color="auto" w:space="0"/>
+            </w:tcBorders>
           </w:tcPr>
           <w:p>
             <w:pPr>
@@ -5355,7 +5809,12 @@
         <w:tc>
           <w:tcPr>
             <w:tcW w:type="dxa" w:w="2946"/>
-            <w:tcBorders/>
+            <w:tcBorders>
+              <w:top w:val="none" w:sz="0" w:color="auto" w:space="0"/>
+              <w:bottom w:val="none" w:sz="0" w:color="auto" w:space="0"/>
+              <w:left w:val="none" w:sz="0" w:color="auto" w:space="0"/>
+              <w:right w:val="none" w:sz="0" w:color="auto" w:space="0"/>
+            </w:tcBorders>
           </w:tcPr>
           <w:p>
             <w:pPr>
@@ -5377,7 +5836,12 @@
         <w:tc>
           <w:tcPr>
             <w:tcW w:type="dxa" w:w="2946"/>
-            <w:tcBorders/>
+            <w:tcBorders>
+              <w:top w:val="none" w:sz="0" w:color="auto" w:space="0"/>
+              <w:bottom w:val="none" w:sz="0" w:color="auto" w:space="0"/>
+              <w:left w:val="none" w:sz="0" w:color="auto" w:space="0"/>
+              <w:right w:val="none" w:sz="0" w:color="auto" w:space="0"/>
+            </w:tcBorders>
           </w:tcPr>
           <w:p>
             <w:pPr>
@@ -5399,7 +5863,12 @@
         <w:tc>
           <w:tcPr>
             <w:tcW w:type="dxa" w:w="2946"/>
-            <w:tcBorders/>
+            <w:tcBorders>
+              <w:top w:val="none" w:sz="0" w:color="auto" w:space="0"/>
+              <w:bottom w:val="none" w:sz="0" w:color="auto" w:space="0"/>
+              <w:left w:val="none" w:sz="0" w:color="auto" w:space="0"/>
+              <w:right w:val="none" w:sz="0" w:color="auto" w:space="0"/>
+            </w:tcBorders>
           </w:tcPr>
           <w:p>
             <w:pPr>
@@ -5423,7 +5892,12 @@
         <w:tc>
           <w:tcPr>
             <w:tcW w:type="dxa" w:w="2946"/>
-            <w:tcBorders/>
+            <w:tcBorders>
+              <w:top w:val="none" w:sz="0" w:color="auto" w:space="0"/>
+              <w:bottom w:val="none" w:sz="0" w:color="auto" w:space="0"/>
+              <w:left w:val="none" w:sz="0" w:color="auto" w:space="0"/>
+              <w:right w:val="none" w:sz="0" w:color="auto" w:space="0"/>
+            </w:tcBorders>
           </w:tcPr>
           <w:p>
             <w:pPr>
@@ -5445,7 +5919,12 @@
         <w:tc>
           <w:tcPr>
             <w:tcW w:type="dxa" w:w="2946"/>
-            <w:tcBorders/>
+            <w:tcBorders>
+              <w:top w:val="none" w:sz="0" w:color="auto" w:space="0"/>
+              <w:bottom w:val="none" w:sz="0" w:color="auto" w:space="0"/>
+              <w:left w:val="none" w:sz="0" w:color="auto" w:space="0"/>
+              <w:right w:val="none" w:sz="0" w:color="auto" w:space="0"/>
+            </w:tcBorders>
           </w:tcPr>
           <w:p>
             <w:pPr>
@@ -5467,7 +5946,12 @@
         <w:tc>
           <w:tcPr>
             <w:tcW w:type="dxa" w:w="2946"/>
-            <w:tcBorders/>
+            <w:tcBorders>
+              <w:top w:val="none" w:sz="0" w:color="auto" w:space="0"/>
+              <w:bottom w:val="none" w:sz="0" w:color="auto" w:space="0"/>
+              <w:left w:val="none" w:sz="0" w:color="auto" w:space="0"/>
+              <w:right w:val="none" w:sz="0" w:color="auto" w:space="0"/>
+            </w:tcBorders>
           </w:tcPr>
           <w:p>
             <w:pPr>
@@ -5491,7 +5975,12 @@
         <w:tc>
           <w:tcPr>
             <w:tcW w:type="dxa" w:w="2946"/>
-            <w:tcBorders/>
+            <w:tcBorders>
+              <w:top w:val="none" w:sz="0" w:color="auto" w:space="0"/>
+              <w:bottom w:val="none" w:sz="0" w:color="auto" w:space="0"/>
+              <w:left w:val="none" w:sz="0" w:color="auto" w:space="0"/>
+              <w:right w:val="none" w:sz="0" w:color="auto" w:space="0"/>
+            </w:tcBorders>
           </w:tcPr>
           <w:p>
             <w:pPr>
@@ -5513,7 +6002,12 @@
         <w:tc>
           <w:tcPr>
             <w:tcW w:type="dxa" w:w="2946"/>
-            <w:tcBorders/>
+            <w:tcBorders>
+              <w:top w:val="none" w:sz="0" w:color="auto" w:space="0"/>
+              <w:bottom w:val="none" w:sz="0" w:color="auto" w:space="0"/>
+              <w:left w:val="none" w:sz="0" w:color="auto" w:space="0"/>
+              <w:right w:val="none" w:sz="0" w:color="auto" w:space="0"/>
+            </w:tcBorders>
           </w:tcPr>
           <w:p>
             <w:pPr>
@@ -5535,7 +6029,12 @@
         <w:tc>
           <w:tcPr>
             <w:tcW w:type="dxa" w:w="2946"/>
-            <w:tcBorders/>
+            <w:tcBorders>
+              <w:top w:val="none" w:sz="0" w:color="auto" w:space="0"/>
+              <w:bottom w:val="none" w:sz="0" w:color="auto" w:space="0"/>
+              <w:left w:val="none" w:sz="0" w:color="auto" w:space="0"/>
+              <w:right w:val="none" w:sz="0" w:color="auto" w:space="0"/>
+            </w:tcBorders>
           </w:tcPr>
           <w:p>
             <w:pPr>
@@ -5559,7 +6058,12 @@
         <w:tc>
           <w:tcPr>
             <w:tcW w:type="dxa" w:w="2946"/>
-            <w:tcBorders/>
+            <w:tcBorders>
+              <w:top w:val="none" w:sz="0" w:color="auto" w:space="0"/>
+              <w:bottom w:val="none" w:sz="0" w:color="auto" w:space="0"/>
+              <w:left w:val="none" w:sz="0" w:color="auto" w:space="0"/>
+              <w:right w:val="none" w:sz="0" w:color="auto" w:space="0"/>
+            </w:tcBorders>
           </w:tcPr>
           <w:p>
             <w:pPr>
@@ -5581,7 +6085,12 @@
         <w:tc>
           <w:tcPr>
             <w:tcW w:type="dxa" w:w="2946"/>
-            <w:tcBorders/>
+            <w:tcBorders>
+              <w:top w:val="none" w:sz="0" w:color="auto" w:space="0"/>
+              <w:bottom w:val="none" w:sz="0" w:color="auto" w:space="0"/>
+              <w:left w:val="none" w:sz="0" w:color="auto" w:space="0"/>
+              <w:right w:val="none" w:sz="0" w:color="auto" w:space="0"/>
+            </w:tcBorders>
           </w:tcPr>
           <w:p>
             <w:pPr>
@@ -5603,7 +6112,12 @@
         <w:tc>
           <w:tcPr>
             <w:tcW w:type="dxa" w:w="2946"/>
-            <w:tcBorders/>
+            <w:tcBorders>
+              <w:top w:val="none" w:sz="0" w:color="auto" w:space="0"/>
+              <w:bottom w:val="none" w:sz="0" w:color="auto" w:space="0"/>
+              <w:left w:val="none" w:sz="0" w:color="auto" w:space="0"/>
+              <w:right w:val="none" w:sz="0" w:color="auto" w:space="0"/>
+            </w:tcBorders>
           </w:tcPr>
           <w:p>
             <w:pPr>
@@ -5627,7 +6141,12 @@
         <w:tc>
           <w:tcPr>
             <w:tcW w:type="dxa" w:w="2946"/>
-            <w:tcBorders/>
+            <w:tcBorders>
+              <w:top w:val="none" w:sz="0" w:color="auto" w:space="0"/>
+              <w:bottom w:val="none" w:sz="0" w:color="auto" w:space="0"/>
+              <w:left w:val="none" w:sz="0" w:color="auto" w:space="0"/>
+              <w:right w:val="none" w:sz="0" w:color="auto" w:space="0"/>
+            </w:tcBorders>
           </w:tcPr>
           <w:p>
             <w:pPr>
@@ -5649,7 +6168,12 @@
         <w:tc>
           <w:tcPr>
             <w:tcW w:type="dxa" w:w="2946"/>
-            <w:tcBorders/>
+            <w:tcBorders>
+              <w:top w:val="none" w:sz="0" w:color="auto" w:space="0"/>
+              <w:bottom w:val="none" w:sz="0" w:color="auto" w:space="0"/>
+              <w:left w:val="none" w:sz="0" w:color="auto" w:space="0"/>
+              <w:right w:val="none" w:sz="0" w:color="auto" w:space="0"/>
+            </w:tcBorders>
           </w:tcPr>
           <w:p>
             <w:pPr>
@@ -5671,7 +6195,12 @@
         <w:tc>
           <w:tcPr>
             <w:tcW w:type="dxa" w:w="2946"/>
-            <w:tcBorders/>
+            <w:tcBorders>
+              <w:top w:val="none" w:sz="0" w:color="auto" w:space="0"/>
+              <w:bottom w:val="none" w:sz="0" w:color="auto" w:space="0"/>
+              <w:left w:val="none" w:sz="0" w:color="auto" w:space="0"/>
+              <w:right w:val="none" w:sz="0" w:color="auto" w:space="0"/>
+            </w:tcBorders>
           </w:tcPr>
           <w:p>
             <w:pPr>
@@ -5695,7 +6224,12 @@
         <w:tc>
           <w:tcPr>
             <w:tcW w:type="dxa" w:w="2946"/>
-            <w:tcBorders/>
+            <w:tcBorders>
+              <w:top w:val="none" w:sz="0" w:color="auto" w:space="0"/>
+              <w:bottom w:val="none" w:sz="0" w:color="auto" w:space="0"/>
+              <w:left w:val="none" w:sz="0" w:color="auto" w:space="0"/>
+              <w:right w:val="none" w:sz="0" w:color="auto" w:space="0"/>
+            </w:tcBorders>
           </w:tcPr>
           <w:p>
             <w:pPr>
@@ -5717,7 +6251,12 @@
         <w:tc>
           <w:tcPr>
             <w:tcW w:type="dxa" w:w="2946"/>
-            <w:tcBorders/>
+            <w:tcBorders>
+              <w:top w:val="none" w:sz="0" w:color="auto" w:space="0"/>
+              <w:bottom w:val="none" w:sz="0" w:color="auto" w:space="0"/>
+              <w:left w:val="none" w:sz="0" w:color="auto" w:space="0"/>
+              <w:right w:val="none" w:sz="0" w:color="auto" w:space="0"/>
+            </w:tcBorders>
           </w:tcPr>
           <w:p>
             <w:pPr>
@@ -5739,7 +6278,12 @@
         <w:tc>
           <w:tcPr>
             <w:tcW w:type="dxa" w:w="2946"/>
-            <w:tcBorders/>
+            <w:tcBorders>
+              <w:top w:val="none" w:sz="0" w:color="auto" w:space="0"/>
+              <w:bottom w:val="none" w:sz="0" w:color="auto" w:space="0"/>
+              <w:left w:val="none" w:sz="0" w:color="auto" w:space="0"/>
+              <w:right w:val="none" w:sz="0" w:color="auto" w:space="0"/>
+            </w:tcBorders>
           </w:tcPr>
           <w:p>
             <w:pPr>
@@ -5763,7 +6307,12 @@
         <w:tc>
           <w:tcPr>
             <w:tcW w:type="dxa" w:w="2946"/>
-            <w:tcBorders/>
+            <w:tcBorders>
+              <w:top w:val="none" w:sz="0" w:color="auto" w:space="0"/>
+              <w:bottom w:val="none" w:sz="0" w:color="auto" w:space="0"/>
+              <w:left w:val="none" w:sz="0" w:color="auto" w:space="0"/>
+              <w:right w:val="none" w:sz="0" w:color="auto" w:space="0"/>
+            </w:tcBorders>
           </w:tcPr>
           <w:p>
             <w:pPr>
@@ -5785,7 +6334,12 @@
         <w:tc>
           <w:tcPr>
             <w:tcW w:type="dxa" w:w="2946"/>
-            <w:tcBorders/>
+            <w:tcBorders>
+              <w:top w:val="none" w:sz="0" w:color="auto" w:space="0"/>
+              <w:bottom w:val="none" w:sz="0" w:color="auto" w:space="0"/>
+              <w:left w:val="none" w:sz="0" w:color="auto" w:space="0"/>
+              <w:right w:val="none" w:sz="0" w:color="auto" w:space="0"/>
+            </w:tcBorders>
           </w:tcPr>
           <w:p>
             <w:pPr>
@@ -5807,7 +6361,12 @@
         <w:tc>
           <w:tcPr>
             <w:tcW w:type="dxa" w:w="2946"/>
-            <w:tcBorders/>
+            <w:tcBorders>
+              <w:top w:val="none" w:sz="0" w:color="auto" w:space="0"/>
+              <w:bottom w:val="none" w:sz="0" w:color="auto" w:space="0"/>
+              <w:left w:val="none" w:sz="0" w:color="auto" w:space="0"/>
+              <w:right w:val="none" w:sz="0" w:color="auto" w:space="0"/>
+            </w:tcBorders>
           </w:tcPr>
           <w:p>
             <w:pPr>
@@ -5832,7 +6391,10 @@
           <w:tcPr>
             <w:tcW w:type="dxa" w:w="2946"/>
             <w:tcBorders>
+              <w:top w:val="none" w:sz="0" w:color="auto" w:space="0"/>
               <w:bottom w:val="single" w:sz="8" w:color="000000" w:space="0"/>
+              <w:left w:val="none" w:sz="0" w:color="auto" w:space="0"/>
+              <w:right w:val="none" w:sz="0" w:color="auto" w:space="0"/>
             </w:tcBorders>
           </w:tcPr>
           <w:p>
@@ -5856,7 +6418,10 @@
           <w:tcPr>
             <w:tcW w:type="dxa" w:w="2946"/>
             <w:tcBorders>
+              <w:top w:val="none" w:sz="0" w:color="auto" w:space="0"/>
               <w:bottom w:val="single" w:sz="8" w:color="000000" w:space="0"/>
+              <w:left w:val="none" w:sz="0" w:color="auto" w:space="0"/>
+              <w:right w:val="none" w:sz="0" w:color="auto" w:space="0"/>
             </w:tcBorders>
           </w:tcPr>
           <w:p>
@@ -5880,7 +6445,10 @@
           <w:tcPr>
             <w:tcW w:type="dxa" w:w="2946"/>
             <w:tcBorders>
+              <w:top w:val="none" w:sz="0" w:color="auto" w:space="0"/>
               <w:bottom w:val="single" w:sz="8" w:color="000000" w:space="0"/>
+              <w:left w:val="none" w:sz="0" w:color="auto" w:space="0"/>
+              <w:right w:val="none" w:sz="0" w:color="auto" w:space="0"/>
             </w:tcBorders>
           </w:tcPr>
           <w:p>
@@ -5933,7 +6501,6 @@
     </w:p>
     <w:tbl>
       <w:tblPr>
-        <w:tblStyle w:val="TableGrid"/>
         <w:tblW w:type="auto" w:w="0"/>
         <w:tblLook w:firstColumn="1" w:firstRow="1" w:lastColumn="0" w:lastRow="0" w:noHBand="0" w:noVBand="1" w:val="04A0"/>
         <w:tblBorders>
@@ -5958,6 +6525,8 @@
             <w:tcBorders>
               <w:top w:val="single" w:sz="8" w:color="000000" w:space="0"/>
               <w:bottom w:val="single" w:sz="4" w:color="000000" w:space="0"/>
+              <w:left w:val="none" w:sz="0" w:color="auto" w:space="0"/>
+              <w:right w:val="none" w:sz="0" w:color="auto" w:space="0"/>
             </w:tcBorders>
           </w:tcPr>
           <w:p>
@@ -5983,6 +6552,8 @@
             <w:tcBorders>
               <w:top w:val="single" w:sz="8" w:color="000000" w:space="0"/>
               <w:bottom w:val="single" w:sz="4" w:color="000000" w:space="0"/>
+              <w:left w:val="none" w:sz="0" w:color="auto" w:space="0"/>
+              <w:right w:val="none" w:sz="0" w:color="auto" w:space="0"/>
             </w:tcBorders>
           </w:tcPr>
           <w:p>
@@ -6008,6 +6579,8 @@
             <w:tcBorders>
               <w:top w:val="single" w:sz="8" w:color="000000" w:space="0"/>
               <w:bottom w:val="single" w:sz="4" w:color="000000" w:space="0"/>
+              <w:left w:val="none" w:sz="0" w:color="auto" w:space="0"/>
+              <w:right w:val="none" w:sz="0" w:color="auto" w:space="0"/>
             </w:tcBorders>
           </w:tcPr>
           <w:p>
@@ -6033,6 +6606,8 @@
             <w:tcBorders>
               <w:top w:val="single" w:sz="8" w:color="000000" w:space="0"/>
               <w:bottom w:val="single" w:sz="4" w:color="000000" w:space="0"/>
+              <w:left w:val="none" w:sz="0" w:color="auto" w:space="0"/>
+              <w:right w:val="none" w:sz="0" w:color="auto" w:space="0"/>
             </w:tcBorders>
           </w:tcPr>
           <w:p>
@@ -6057,7 +6632,12 @@
         <w:tc>
           <w:tcPr>
             <w:tcW w:type="dxa" w:w="2209"/>
-            <w:tcBorders/>
+            <w:tcBorders>
+              <w:top w:val="none" w:sz="0" w:color="auto" w:space="0"/>
+              <w:bottom w:val="none" w:sz="0" w:color="auto" w:space="0"/>
+              <w:left w:val="none" w:sz="0" w:color="auto" w:space="0"/>
+              <w:right w:val="none" w:sz="0" w:color="auto" w:space="0"/>
+            </w:tcBorders>
           </w:tcPr>
           <w:p>
             <w:pPr>
@@ -6079,7 +6659,12 @@
         <w:tc>
           <w:tcPr>
             <w:tcW w:type="dxa" w:w="2209"/>
-            <w:tcBorders/>
+            <w:tcBorders>
+              <w:top w:val="none" w:sz="0" w:color="auto" w:space="0"/>
+              <w:bottom w:val="none" w:sz="0" w:color="auto" w:space="0"/>
+              <w:left w:val="none" w:sz="0" w:color="auto" w:space="0"/>
+              <w:right w:val="none" w:sz="0" w:color="auto" w:space="0"/>
+            </w:tcBorders>
           </w:tcPr>
           <w:p>
             <w:pPr>
@@ -6101,7 +6686,12 @@
         <w:tc>
           <w:tcPr>
             <w:tcW w:type="dxa" w:w="2209"/>
-            <w:tcBorders/>
+            <w:tcBorders>
+              <w:top w:val="none" w:sz="0" w:color="auto" w:space="0"/>
+              <w:bottom w:val="none" w:sz="0" w:color="auto" w:space="0"/>
+              <w:left w:val="none" w:sz="0" w:color="auto" w:space="0"/>
+              <w:right w:val="none" w:sz="0" w:color="auto" w:space="0"/>
+            </w:tcBorders>
           </w:tcPr>
           <w:p>
             <w:pPr>
@@ -6123,7 +6713,12 @@
         <w:tc>
           <w:tcPr>
             <w:tcW w:type="dxa" w:w="2209"/>
-            <w:tcBorders/>
+            <w:tcBorders>
+              <w:top w:val="none" w:sz="0" w:color="auto" w:space="0"/>
+              <w:bottom w:val="none" w:sz="0" w:color="auto" w:space="0"/>
+              <w:left w:val="none" w:sz="0" w:color="auto" w:space="0"/>
+              <w:right w:val="none" w:sz="0" w:color="auto" w:space="0"/>
+            </w:tcBorders>
           </w:tcPr>
           <w:p>
             <w:pPr>
@@ -6147,7 +6742,12 @@
         <w:tc>
           <w:tcPr>
             <w:tcW w:type="dxa" w:w="2209"/>
-            <w:tcBorders/>
+            <w:tcBorders>
+              <w:top w:val="none" w:sz="0" w:color="auto" w:space="0"/>
+              <w:bottom w:val="none" w:sz="0" w:color="auto" w:space="0"/>
+              <w:left w:val="none" w:sz="0" w:color="auto" w:space="0"/>
+              <w:right w:val="none" w:sz="0" w:color="auto" w:space="0"/>
+            </w:tcBorders>
           </w:tcPr>
           <w:p>
             <w:pPr>
@@ -6169,7 +6769,12 @@
         <w:tc>
           <w:tcPr>
             <w:tcW w:type="dxa" w:w="2209"/>
-            <w:tcBorders/>
+            <w:tcBorders>
+              <w:top w:val="none" w:sz="0" w:color="auto" w:space="0"/>
+              <w:bottom w:val="none" w:sz="0" w:color="auto" w:space="0"/>
+              <w:left w:val="none" w:sz="0" w:color="auto" w:space="0"/>
+              <w:right w:val="none" w:sz="0" w:color="auto" w:space="0"/>
+            </w:tcBorders>
           </w:tcPr>
           <w:p>
             <w:pPr>
@@ -6191,7 +6796,12 @@
         <w:tc>
           <w:tcPr>
             <w:tcW w:type="dxa" w:w="2209"/>
-            <w:tcBorders/>
+            <w:tcBorders>
+              <w:top w:val="none" w:sz="0" w:color="auto" w:space="0"/>
+              <w:bottom w:val="none" w:sz="0" w:color="auto" w:space="0"/>
+              <w:left w:val="none" w:sz="0" w:color="auto" w:space="0"/>
+              <w:right w:val="none" w:sz="0" w:color="auto" w:space="0"/>
+            </w:tcBorders>
           </w:tcPr>
           <w:p>
             <w:pPr>
@@ -6213,7 +6823,12 @@
         <w:tc>
           <w:tcPr>
             <w:tcW w:type="dxa" w:w="2209"/>
-            <w:tcBorders/>
+            <w:tcBorders>
+              <w:top w:val="none" w:sz="0" w:color="auto" w:space="0"/>
+              <w:bottom w:val="none" w:sz="0" w:color="auto" w:space="0"/>
+              <w:left w:val="none" w:sz="0" w:color="auto" w:space="0"/>
+              <w:right w:val="none" w:sz="0" w:color="auto" w:space="0"/>
+            </w:tcBorders>
           </w:tcPr>
           <w:p>
             <w:pPr>
@@ -6237,7 +6852,12 @@
         <w:tc>
           <w:tcPr>
             <w:tcW w:type="dxa" w:w="2209"/>
-            <w:tcBorders/>
+            <w:tcBorders>
+              <w:top w:val="none" w:sz="0" w:color="auto" w:space="0"/>
+              <w:bottom w:val="none" w:sz="0" w:color="auto" w:space="0"/>
+              <w:left w:val="none" w:sz="0" w:color="auto" w:space="0"/>
+              <w:right w:val="none" w:sz="0" w:color="auto" w:space="0"/>
+            </w:tcBorders>
           </w:tcPr>
           <w:p>
             <w:pPr>
@@ -6259,7 +6879,12 @@
         <w:tc>
           <w:tcPr>
             <w:tcW w:type="dxa" w:w="2209"/>
-            <w:tcBorders/>
+            <w:tcBorders>
+              <w:top w:val="none" w:sz="0" w:color="auto" w:space="0"/>
+              <w:bottom w:val="none" w:sz="0" w:color="auto" w:space="0"/>
+              <w:left w:val="none" w:sz="0" w:color="auto" w:space="0"/>
+              <w:right w:val="none" w:sz="0" w:color="auto" w:space="0"/>
+            </w:tcBorders>
           </w:tcPr>
           <w:p>
             <w:pPr>
@@ -6281,7 +6906,12 @@
         <w:tc>
           <w:tcPr>
             <w:tcW w:type="dxa" w:w="2209"/>
-            <w:tcBorders/>
+            <w:tcBorders>
+              <w:top w:val="none" w:sz="0" w:color="auto" w:space="0"/>
+              <w:bottom w:val="none" w:sz="0" w:color="auto" w:space="0"/>
+              <w:left w:val="none" w:sz="0" w:color="auto" w:space="0"/>
+              <w:right w:val="none" w:sz="0" w:color="auto" w:space="0"/>
+            </w:tcBorders>
           </w:tcPr>
           <w:p>
             <w:pPr>
@@ -6303,7 +6933,12 @@
         <w:tc>
           <w:tcPr>
             <w:tcW w:type="dxa" w:w="2209"/>
-            <w:tcBorders/>
+            <w:tcBorders>
+              <w:top w:val="none" w:sz="0" w:color="auto" w:space="0"/>
+              <w:bottom w:val="none" w:sz="0" w:color="auto" w:space="0"/>
+              <w:left w:val="none" w:sz="0" w:color="auto" w:space="0"/>
+              <w:right w:val="none" w:sz="0" w:color="auto" w:space="0"/>
+            </w:tcBorders>
           </w:tcPr>
           <w:p>
             <w:pPr>
@@ -6327,7 +6962,12 @@
         <w:tc>
           <w:tcPr>
             <w:tcW w:type="dxa" w:w="2209"/>
-            <w:tcBorders/>
+            <w:tcBorders>
+              <w:top w:val="none" w:sz="0" w:color="auto" w:space="0"/>
+              <w:bottom w:val="none" w:sz="0" w:color="auto" w:space="0"/>
+              <w:left w:val="none" w:sz="0" w:color="auto" w:space="0"/>
+              <w:right w:val="none" w:sz="0" w:color="auto" w:space="0"/>
+            </w:tcBorders>
           </w:tcPr>
           <w:p>
             <w:pPr>
@@ -6349,7 +6989,12 @@
         <w:tc>
           <w:tcPr>
             <w:tcW w:type="dxa" w:w="2209"/>
-            <w:tcBorders/>
+            <w:tcBorders>
+              <w:top w:val="none" w:sz="0" w:color="auto" w:space="0"/>
+              <w:bottom w:val="none" w:sz="0" w:color="auto" w:space="0"/>
+              <w:left w:val="none" w:sz="0" w:color="auto" w:space="0"/>
+              <w:right w:val="none" w:sz="0" w:color="auto" w:space="0"/>
+            </w:tcBorders>
           </w:tcPr>
           <w:p>
             <w:pPr>
@@ -6371,7 +7016,12 @@
         <w:tc>
           <w:tcPr>
             <w:tcW w:type="dxa" w:w="2209"/>
-            <w:tcBorders/>
+            <w:tcBorders>
+              <w:top w:val="none" w:sz="0" w:color="auto" w:space="0"/>
+              <w:bottom w:val="none" w:sz="0" w:color="auto" w:space="0"/>
+              <w:left w:val="none" w:sz="0" w:color="auto" w:space="0"/>
+              <w:right w:val="none" w:sz="0" w:color="auto" w:space="0"/>
+            </w:tcBorders>
           </w:tcPr>
           <w:p>
             <w:pPr>
@@ -6393,7 +7043,12 @@
         <w:tc>
           <w:tcPr>
             <w:tcW w:type="dxa" w:w="2209"/>
-            <w:tcBorders/>
+            <w:tcBorders>
+              <w:top w:val="none" w:sz="0" w:color="auto" w:space="0"/>
+              <w:bottom w:val="none" w:sz="0" w:color="auto" w:space="0"/>
+              <w:left w:val="none" w:sz="0" w:color="auto" w:space="0"/>
+              <w:right w:val="none" w:sz="0" w:color="auto" w:space="0"/>
+            </w:tcBorders>
           </w:tcPr>
           <w:p>
             <w:pPr>
@@ -6417,7 +7072,12 @@
         <w:tc>
           <w:tcPr>
             <w:tcW w:type="dxa" w:w="2209"/>
-            <w:tcBorders/>
+            <w:tcBorders>
+              <w:top w:val="none" w:sz="0" w:color="auto" w:space="0"/>
+              <w:bottom w:val="none" w:sz="0" w:color="auto" w:space="0"/>
+              <w:left w:val="none" w:sz="0" w:color="auto" w:space="0"/>
+              <w:right w:val="none" w:sz="0" w:color="auto" w:space="0"/>
+            </w:tcBorders>
           </w:tcPr>
           <w:p>
             <w:pPr>
@@ -6439,7 +7099,12 @@
         <w:tc>
           <w:tcPr>
             <w:tcW w:type="dxa" w:w="2209"/>
-            <w:tcBorders/>
+            <w:tcBorders>
+              <w:top w:val="none" w:sz="0" w:color="auto" w:space="0"/>
+              <w:bottom w:val="none" w:sz="0" w:color="auto" w:space="0"/>
+              <w:left w:val="none" w:sz="0" w:color="auto" w:space="0"/>
+              <w:right w:val="none" w:sz="0" w:color="auto" w:space="0"/>
+            </w:tcBorders>
           </w:tcPr>
           <w:p>
             <w:pPr>
@@ -6461,7 +7126,12 @@
         <w:tc>
           <w:tcPr>
             <w:tcW w:type="dxa" w:w="2209"/>
-            <w:tcBorders/>
+            <w:tcBorders>
+              <w:top w:val="none" w:sz="0" w:color="auto" w:space="0"/>
+              <w:bottom w:val="none" w:sz="0" w:color="auto" w:space="0"/>
+              <w:left w:val="none" w:sz="0" w:color="auto" w:space="0"/>
+              <w:right w:val="none" w:sz="0" w:color="auto" w:space="0"/>
+            </w:tcBorders>
           </w:tcPr>
           <w:p>
             <w:pPr>
@@ -6483,7 +7153,12 @@
         <w:tc>
           <w:tcPr>
             <w:tcW w:type="dxa" w:w="2209"/>
-            <w:tcBorders/>
+            <w:tcBorders>
+              <w:top w:val="none" w:sz="0" w:color="auto" w:space="0"/>
+              <w:bottom w:val="none" w:sz="0" w:color="auto" w:space="0"/>
+              <w:left w:val="none" w:sz="0" w:color="auto" w:space="0"/>
+              <w:right w:val="none" w:sz="0" w:color="auto" w:space="0"/>
+            </w:tcBorders>
           </w:tcPr>
           <w:p>
             <w:pPr>
@@ -6507,7 +7182,12 @@
         <w:tc>
           <w:tcPr>
             <w:tcW w:type="dxa" w:w="2209"/>
-            <w:tcBorders/>
+            <w:tcBorders>
+              <w:top w:val="none" w:sz="0" w:color="auto" w:space="0"/>
+              <w:bottom w:val="none" w:sz="0" w:color="auto" w:space="0"/>
+              <w:left w:val="none" w:sz="0" w:color="auto" w:space="0"/>
+              <w:right w:val="none" w:sz="0" w:color="auto" w:space="0"/>
+            </w:tcBorders>
           </w:tcPr>
           <w:p>
             <w:pPr>
@@ -6529,7 +7209,12 @@
         <w:tc>
           <w:tcPr>
             <w:tcW w:type="dxa" w:w="2209"/>
-            <w:tcBorders/>
+            <w:tcBorders>
+              <w:top w:val="none" w:sz="0" w:color="auto" w:space="0"/>
+              <w:bottom w:val="none" w:sz="0" w:color="auto" w:space="0"/>
+              <w:left w:val="none" w:sz="0" w:color="auto" w:space="0"/>
+              <w:right w:val="none" w:sz="0" w:color="auto" w:space="0"/>
+            </w:tcBorders>
           </w:tcPr>
           <w:p>
             <w:pPr>
@@ -6551,7 +7236,12 @@
         <w:tc>
           <w:tcPr>
             <w:tcW w:type="dxa" w:w="2209"/>
-            <w:tcBorders/>
+            <w:tcBorders>
+              <w:top w:val="none" w:sz="0" w:color="auto" w:space="0"/>
+              <w:bottom w:val="none" w:sz="0" w:color="auto" w:space="0"/>
+              <w:left w:val="none" w:sz="0" w:color="auto" w:space="0"/>
+              <w:right w:val="none" w:sz="0" w:color="auto" w:space="0"/>
+            </w:tcBorders>
           </w:tcPr>
           <w:p>
             <w:pPr>
@@ -6573,7 +7263,12 @@
         <w:tc>
           <w:tcPr>
             <w:tcW w:type="dxa" w:w="2209"/>
-            <w:tcBorders/>
+            <w:tcBorders>
+              <w:top w:val="none" w:sz="0" w:color="auto" w:space="0"/>
+              <w:bottom w:val="none" w:sz="0" w:color="auto" w:space="0"/>
+              <w:left w:val="none" w:sz="0" w:color="auto" w:space="0"/>
+              <w:right w:val="none" w:sz="0" w:color="auto" w:space="0"/>
+            </w:tcBorders>
           </w:tcPr>
           <w:p>
             <w:pPr>
@@ -6598,7 +7293,10 @@
           <w:tcPr>
             <w:tcW w:type="dxa" w:w="2209"/>
             <w:tcBorders>
+              <w:top w:val="none" w:sz="0" w:color="auto" w:space="0"/>
               <w:bottom w:val="single" w:sz="8" w:color="000000" w:space="0"/>
+              <w:left w:val="none" w:sz="0" w:color="auto" w:space="0"/>
+              <w:right w:val="none" w:sz="0" w:color="auto" w:space="0"/>
             </w:tcBorders>
           </w:tcPr>
           <w:p>
@@ -6622,7 +7320,10 @@
           <w:tcPr>
             <w:tcW w:type="dxa" w:w="2209"/>
             <w:tcBorders>
+              <w:top w:val="none" w:sz="0" w:color="auto" w:space="0"/>
               <w:bottom w:val="single" w:sz="8" w:color="000000" w:space="0"/>
+              <w:left w:val="none" w:sz="0" w:color="auto" w:space="0"/>
+              <w:right w:val="none" w:sz="0" w:color="auto" w:space="0"/>
             </w:tcBorders>
           </w:tcPr>
           <w:p>
@@ -6646,7 +7347,10 @@
           <w:tcPr>
             <w:tcW w:type="dxa" w:w="2209"/>
             <w:tcBorders>
+              <w:top w:val="none" w:sz="0" w:color="auto" w:space="0"/>
               <w:bottom w:val="single" w:sz="8" w:color="000000" w:space="0"/>
+              <w:left w:val="none" w:sz="0" w:color="auto" w:space="0"/>
+              <w:right w:val="none" w:sz="0" w:color="auto" w:space="0"/>
             </w:tcBorders>
           </w:tcPr>
           <w:p>
@@ -6670,7 +7374,10 @@
           <w:tcPr>
             <w:tcW w:type="dxa" w:w="2209"/>
             <w:tcBorders>
+              <w:top w:val="none" w:sz="0" w:color="auto" w:space="0"/>
               <w:bottom w:val="single" w:sz="8" w:color="000000" w:space="0"/>
+              <w:left w:val="none" w:sz="0" w:color="auto" w:space="0"/>
+              <w:right w:val="none" w:sz="0" w:color="auto" w:space="0"/>
             </w:tcBorders>
           </w:tcPr>
           <w:p>

</xml_diff>